<commit_message>
kiosk: gate travel/draw split by facility, not employee
Travel/draw two-rate split now applies only at designated distant
facilities (Yucca Valley; Leisure Garden for phlebs not home-based
there) instead of the hardcoded Krys Ellis / Enrique Blanco list. All
other facilities pay a single draw rate. Travel-rate pay-profile field
opens to all phlebotomists. Compensation agreement §2 updated to match.

Co-Authored-By: Claude Opus 4.8 <noreply@anthropic.com>
</commit_message>
<xml_diff>
--- a/clients/juno-tech/Phlebotomist-Compensation-Agreement.docx
+++ b/clients/juno-tech/Phlebotomist-Compensation-Agreement.docx
@@ -654,10 +654,19 @@
       </w:pPr>
       <w:r>
         <w:rPr>
-          <w:sz w:val="21"/>
-          <w:szCs w:val="21"/>
-        </w:rPr>
-        <w:t xml:space="preserve">The Employee is paid two hourly rates, applied to the type of time worked during the shift:</w:t>
+          <w:b/>
+          <w:bCs/>
+          <w:sz w:val="21"/>
+          <w:szCs w:val="21"/>
+        </w:rPr>
+        <w:t xml:space="preserve">Most shifts are paid at a single Draw Rate for the entire shift.</w:t>
+      </w:r>
+      <w:r>
+        <w:rPr>
+          <w:sz w:val="21"/>
+          <w:szCs w:val="21"/>
+        </w:rPr>
+        <w:t xml:space="preserve"> A separate, lower Travel Rate applies only when the Employee is assigned to a designated distant facility (see 2.1). The two rates are:</w:t>
       </w:r>
     </w:p>
     <w:tbl>
@@ -797,7 +806,7 @@
                 <w:sz w:val="20"/>
                 <w:szCs w:val="20"/>
               </w:rPr>
-              <w:t xml:space="preserve">Active work — phlebotomy, patient processing, sample handling, and other productive duties at the facility.</w:t>
+              <w:t xml:space="preserve">Active work — phlebotomy, patient processing, sample handling, and other productive duties. Paid for the whole shift at all local facilities.</w:t>
             </w:r>
           </w:p>
         </w:tc>
@@ -874,7 +883,7 @@
                 <w:sz w:val="20"/>
                 <w:szCs w:val="20"/>
               </w:rPr>
-              <w:t xml:space="preserve">Non-productive time — compensable travel to and from the facility/assignment and other approved non-productive time.</w:t>
+              <w:t xml:space="preserve">Compensable travel to and from a designated distant facility. Applies only on those assignments.</w:t>
             </w:r>
           </w:p>
         </w:tc>
@@ -911,6 +920,60 @@
         </w:tc>
       </w:tr>
     </w:tbl>
+    <w:p>
+      <w:pPr>
+        <w:spacing w:after="100" w:before="120" w:line="276"/>
+      </w:pPr>
+      <w:r>
+        <w:rPr>
+          <w:b/>
+          <w:bCs/>
+          <w:color w:val="111827"/>
+          <w:sz w:val="21"/>
+          <w:szCs w:val="21"/>
+        </w:rPr>
+        <w:t xml:space="preserve">2.1  When the two-rate split applies. </w:t>
+      </w:r>
+      <w:r>
+        <w:rPr>
+          <w:sz w:val="21"/>
+          <w:szCs w:val="21"/>
+        </w:rPr>
+        <w:t xml:space="preserve">The Travel Rate is used only for shifts at a designated distant facility — currently </w:t>
+      </w:r>
+      <w:r>
+        <w:rPr>
+          <w:b/>
+          <w:bCs/>
+          <w:sz w:val="21"/>
+          <w:szCs w:val="21"/>
+        </w:rPr>
+        <w:t xml:space="preserve">Yucca Valley</w:t>
+      </w:r>
+      <w:r>
+        <w:rPr>
+          <w:sz w:val="21"/>
+          <w:szCs w:val="21"/>
+        </w:rPr>
+        <w:t xml:space="preserve"> and </w:t>
+      </w:r>
+      <w:r>
+        <w:rPr>
+          <w:b/>
+          <w:bCs/>
+          <w:sz w:val="21"/>
+          <w:szCs w:val="21"/>
+        </w:rPr>
+        <w:t xml:space="preserve">Leisure Garden</w:t>
+      </w:r>
+      <w:r>
+        <w:rPr>
+          <w:sz w:val="21"/>
+          <w:szCs w:val="21"/>
+        </w:rPr>
+        <w:t xml:space="preserve"> (Leisure Garden only for phlebotomists who are not based there). For every other facility, the entire shift is paid at the Draw Rate with no travel deduction. On a qualifying distant shift, the supervisor records the approved travel hours; those are paid at the Travel Rate and the remaining hours at the Draw Rate (travel + draw always equals the total paid shift). The Company may update the list of designated distant facilities on written notice.</w:t>
+      </w:r>
+    </w:p>
     <w:p>
       <w:pPr>
         <w:spacing w:after="120" w:before="100"/>
@@ -956,7 +1019,7 @@
           <w:sz w:val="21"/>
           <w:szCs w:val="21"/>
         </w:rPr>
-        <w:t xml:space="preserve">Hours are recorded through the Company timekeeping kiosk. Total paid shift time is split into travel hours and "draw" (active-work) hours; travel hours are recorded by the supervisor/administrator and the remainder of the shift is paid at the Draw Rate. Travel hours plus draw hours always equal the total paid shift.</w:t>
+        <w:t xml:space="preserve">Hours are recorded through the Company timekeeping kiosk. For a designated distant shift, the supervisor/administrator records the travel hours and the remainder is paid at the Draw Rate; local shifts carry no split and are paid entirely at the Draw Rate.</w:t>
       </w:r>
     </w:p>
     <w:p>

</xml_diff>

<commit_message>
contract: drop overtime/breaks section, add short break acknowledgement
Remove the intro paragraph and the Hours/Overtime/Breaks section (covered
by a separate policy). Section 3 is now a one-line acknowledgement that
phlebotomists have the right to a paid 10-min rest break and an unpaid
30-min meal break before the end of the fifth hour.

Co-Authored-By: Claude Opus 4.8 <noreply@anthropic.com>
</commit_message>
<xml_diff>
--- a/clients/juno-tech/Phlebotomist-Compensation-Agreement.docx
+++ b/clients/juno-tech/Phlebotomist-Compensation-Agreement.docx
@@ -264,18 +264,6 @@
       <w:pPr>
         <w:spacing w:after="120"/>
       </w:pPr>
-    </w:p>
-    <w:p>
-      <w:pPr>
-        <w:spacing w:after="120" w:line="276"/>
-      </w:pPr>
-      <w:r>
-        <w:rPr>
-          <w:sz w:val="21"/>
-          <w:szCs w:val="21"/>
-        </w:rPr>
-        <w:t xml:space="preserve">This Compensation Agreement ("Agreement") sets out how the Employee named above is paid for work performed as a phlebotomist for the Company. It supplements, and does not replace, the Employee’s offer letter, the Employee Handbook, and applicable federal and California law. Where any term conflicts with California law, California law controls.</w:t>
-      </w:r>
     </w:p>
     <w:p>
       <w:pPr>
@@ -1035,7 +1023,304 @@
           <w:sz w:val="26"/>
           <w:szCs w:val="26"/>
         </w:rPr>
-        <w:t xml:space="preserve">3.  Hours, Overtime &amp; Breaks</w:t>
+        <w:t xml:space="preserve">3.  Meal &amp; Rest Breaks</w:t>
+      </w:r>
+    </w:p>
+    <w:p>
+      <w:pPr>
+        <w:spacing w:after="120" w:line="276"/>
+      </w:pPr>
+      <w:r>
+        <w:rPr>
+          <w:sz w:val="21"/>
+          <w:szCs w:val="21"/>
+        </w:rPr>
+        <w:t xml:space="preserve">The Employee acknowledges the right to a paid 10-minute rest break and an unpaid 30-minute meal break, to be provided no later than the end of the fifth hour of work. The Company’s full meal- and rest-break policy is set out in a separate document.</w:t>
+      </w:r>
+    </w:p>
+    <w:p>
+      <w:pPr>
+        <w:pStyle w:val="Heading1"/>
+        <w:spacing w:after="120" w:before="260"/>
+      </w:pPr>
+      <w:r>
+        <w:rPr>
+          <w:b/>
+          <w:bCs/>
+          <w:color w:val="1A2B8C"/>
+          <w:sz w:val="26"/>
+          <w:szCs w:val="26"/>
+        </w:rPr>
+        <w:t xml:space="preserve">4.  Mileage Reimbursement</w:t>
+      </w:r>
+    </w:p>
+    <w:p>
+      <w:pPr>
+        <w:spacing w:after="120" w:line="276"/>
+      </w:pPr>
+      <w:r>
+        <w:rPr>
+          <w:sz w:val="21"/>
+          <w:szCs w:val="21"/>
+        </w:rPr>
+        <w:t xml:space="preserve">Approved business mileage driven in a personal vehicle is reimbursed at the IRS standard mileage rate in effect (</w:t>
+      </w:r>
+      <w:r>
+        <w:rPr>
+          <w:b/>
+          <w:bCs/>
+          <w:sz w:val="21"/>
+          <w:szCs w:val="21"/>
+        </w:rPr>
+        <w:t xml:space="preserve">$0.76 per mile for 2026</w:t>
+      </w:r>
+      <w:r>
+        <w:rPr>
+          <w:sz w:val="21"/>
+          <w:szCs w:val="21"/>
+        </w:rPr>
+        <w:t xml:space="preserve">). Mileage reimbursement is a reimbursement of expenses — it is not wages, is added to net pay, and is not subject to payroll tax withholding. Mileage is recorded through the kiosk and paid on the same biweekly cycle.</w:t>
+      </w:r>
+    </w:p>
+    <w:p>
+      <w:pPr>
+        <w:pStyle w:val="Heading1"/>
+        <w:spacing w:after="120" w:before="260"/>
+      </w:pPr>
+      <w:r>
+        <w:rPr>
+          <w:b/>
+          <w:bCs/>
+          <w:color w:val="1A2B8C"/>
+          <w:sz w:val="26"/>
+          <w:szCs w:val="26"/>
+        </w:rPr>
+        <w:t xml:space="preserve">5.  Taxes &amp; Payroll Deductions</w:t>
+      </w:r>
+    </w:p>
+    <w:p>
+      <w:pPr>
+        <w:spacing w:after="120" w:line="276"/>
+      </w:pPr>
+      <w:r>
+        <w:rPr>
+          <w:sz w:val="21"/>
+          <w:szCs w:val="21"/>
+        </w:rPr>
+        <w:t xml:space="preserve">Gross wages are subject to standard payroll withholding. The following are withheld each pay period:</w:t>
+      </w:r>
+    </w:p>
+    <w:p>
+      <w:pPr>
+        <w:pStyle w:val="ListParagraph"/>
+        <w:numPr>
+          <w:ilvl w:val="0"/>
+          <w:numId w:val="3"/>
+        </w:numPr>
+        <w:spacing w:after="60" w:line="268"/>
+      </w:pPr>
+      <w:r>
+        <w:rPr>
+          <w:b/>
+          <w:bCs/>
+          <w:sz w:val="21"/>
+          <w:szCs w:val="21"/>
+        </w:rPr>
+        <w:t xml:space="preserve">Social Security (FICA / OASDI): </w:t>
+      </w:r>
+      <w:r>
+        <w:rPr>
+          <w:sz w:val="21"/>
+          <w:szCs w:val="21"/>
+        </w:rPr>
+        <w:t xml:space="preserve">6.2% of wages, up to the annual Social Security wage base ($176,100 for 2026).</w:t>
+      </w:r>
+    </w:p>
+    <w:p>
+      <w:pPr>
+        <w:pStyle w:val="ListParagraph"/>
+        <w:numPr>
+          <w:ilvl w:val="0"/>
+          <w:numId w:val="3"/>
+        </w:numPr>
+        <w:spacing w:after="60" w:line="268"/>
+      </w:pPr>
+      <w:r>
+        <w:rPr>
+          <w:b/>
+          <w:bCs/>
+          <w:sz w:val="21"/>
+          <w:szCs w:val="21"/>
+        </w:rPr>
+        <w:t xml:space="preserve">Medicare: </w:t>
+      </w:r>
+      <w:r>
+        <w:rPr>
+          <w:sz w:val="21"/>
+          <w:szCs w:val="21"/>
+        </w:rPr>
+        <w:t xml:space="preserve">1.45% of wages.</w:t>
+      </w:r>
+    </w:p>
+    <w:p>
+      <w:pPr>
+        <w:pStyle w:val="ListParagraph"/>
+        <w:numPr>
+          <w:ilvl w:val="0"/>
+          <w:numId w:val="3"/>
+        </w:numPr>
+        <w:spacing w:after="60" w:line="268"/>
+      </w:pPr>
+      <w:r>
+        <w:rPr>
+          <w:b/>
+          <w:bCs/>
+          <w:sz w:val="21"/>
+          <w:szCs w:val="21"/>
+        </w:rPr>
+        <w:t xml:space="preserve">Federal income tax withholding: </w:t>
+      </w:r>
+      <w:r>
+        <w:rPr>
+          <w:sz w:val="21"/>
+          <w:szCs w:val="21"/>
+        </w:rPr>
+        <w:t xml:space="preserve">based on the Employee’s Form W-4 (filing status and adjustments), per IRS Publication 15-T.</w:t>
+      </w:r>
+    </w:p>
+    <w:p>
+      <w:pPr>
+        <w:pStyle w:val="ListParagraph"/>
+        <w:numPr>
+          <w:ilvl w:val="0"/>
+          <w:numId w:val="3"/>
+        </w:numPr>
+        <w:spacing w:after="60" w:line="268"/>
+      </w:pPr>
+      <w:r>
+        <w:rPr>
+          <w:b/>
+          <w:bCs/>
+          <w:sz w:val="21"/>
+          <w:szCs w:val="21"/>
+        </w:rPr>
+        <w:t xml:space="preserve">California income tax withholding: </w:t>
+      </w:r>
+      <w:r>
+        <w:rPr>
+          <w:sz w:val="21"/>
+          <w:szCs w:val="21"/>
+        </w:rPr>
+        <w:t xml:space="preserve">based on the Employee’s Form DE-4 (filing status and allowances).</w:t>
+      </w:r>
+    </w:p>
+    <w:p>
+      <w:pPr>
+        <w:spacing w:after="120" w:line="276"/>
+      </w:pPr>
+      <w:r>
+        <w:rPr>
+          <w:sz w:val="21"/>
+          <w:szCs w:val="21"/>
+        </w:rPr>
+        <w:t xml:space="preserve">The Employee is responsible for keeping Form W-4 and Form DE-4 current. Net pay = gross wages − total withholding + mileage reimbursement. An itemized pay statement is provided each payday showing hours, rates, gross wages, each deduction, mileage, and net pay, as required by Labor Code § 226.</w:t>
+      </w:r>
+    </w:p>
+    <w:p>
+      <w:pPr>
+        <w:pStyle w:val="Heading1"/>
+        <w:spacing w:after="120" w:before="260"/>
+      </w:pPr>
+      <w:r>
+        <w:rPr>
+          <w:b/>
+          <w:bCs/>
+          <w:color w:val="1A2B8C"/>
+          <w:sz w:val="26"/>
+          <w:szCs w:val="26"/>
+        </w:rPr>
+        <w:t xml:space="preserve">6.  Method of Payment</w:t>
+      </w:r>
+    </w:p>
+    <w:p>
+      <w:pPr>
+        <w:spacing w:after="120" w:line="276"/>
+      </w:pPr>
+      <w:r>
+        <w:rPr>
+          <w:sz w:val="21"/>
+          <w:szCs w:val="21"/>
+        </w:rPr>
+        <w:t xml:space="preserve">Wages are paid by (check one): </w:t>
+      </w:r>
+    </w:p>
+    <w:p>
+      <w:pPr>
+        <w:pStyle w:val="ListParagraph"/>
+        <w:numPr>
+          <w:ilvl w:val="0"/>
+          <w:numId w:val="3"/>
+        </w:numPr>
+        <w:spacing w:after="60" w:line="268"/>
+      </w:pPr>
+      <w:r>
+        <w:rPr>
+          <w:sz w:val="21"/>
+          <w:szCs w:val="21"/>
+        </w:rPr>
+        <w:t xml:space="preserve">☐  Direct deposit to the account on file (voided check / authorization form required), or</w:t>
+      </w:r>
+    </w:p>
+    <w:p>
+      <w:pPr>
+        <w:pStyle w:val="ListParagraph"/>
+        <w:numPr>
+          <w:ilvl w:val="0"/>
+          <w:numId w:val="3"/>
+        </w:numPr>
+        <w:spacing w:after="60" w:line="268"/>
+      </w:pPr>
+      <w:r>
+        <w:rPr>
+          <w:sz w:val="21"/>
+          <w:szCs w:val="21"/>
+        </w:rPr>
+        <w:t xml:space="preserve">☐  Live check.</w:t>
+      </w:r>
+    </w:p>
+    <w:p>
+      <w:pPr>
+        <w:spacing w:after="120" w:line="276"/>
+      </w:pPr>
+      <w:r>
+        <w:rPr>
+          <w:sz w:val="21"/>
+          <w:szCs w:val="21"/>
+        </w:rPr>
+        <w:t xml:space="preserve">Selected method: </w:t>
+      </w:r>
+      <w:r>
+        <w:rPr>
+          <w:sz w:val="21"/>
+          <w:szCs w:val="21"/>
+        </w:rPr>
+        <w:t xml:space="preserve">________________________________________ </w:t>
+      </w:r>
+    </w:p>
+    <w:p>
+      <w:pPr>
+        <w:pStyle w:val="Heading1"/>
+        <w:spacing w:after="120" w:before="260"/>
+      </w:pPr>
+      <w:r>
+        <w:rPr>
+          <w:b/>
+          <w:bCs/>
+          <w:color w:val="1A2B8C"/>
+          <w:sz w:val="26"/>
+          <w:szCs w:val="26"/>
+        </w:rPr>
+        <w:t xml:space="preserve">7.  General Terms</w:t>
       </w:r>
     </w:p>
     <w:p>
@@ -1055,14 +1340,14 @@
           <w:sz w:val="21"/>
           <w:szCs w:val="21"/>
         </w:rPr>
-        <w:t xml:space="preserve">Standard shift. </w:t>
-      </w:r>
-      <w:r>
-        <w:rPr>
-          <w:sz w:val="21"/>
-          <w:szCs w:val="21"/>
-        </w:rPr>
-        <w:t xml:space="preserve">A standard shift is scheduled up to eight (8) hours. The kiosk issues a wrap-up alert at 7 hours 30 minutes and a hard clock-out reminder at 8 hours. Working beyond a standard shift requires advance supervisor approval.</w:t>
+        <w:t xml:space="preserve">At-will employment. </w:t>
+      </w:r>
+      <w:r>
+        <w:rPr>
+          <w:sz w:val="21"/>
+          <w:szCs w:val="21"/>
+        </w:rPr>
+        <w:t xml:space="preserve">Nothing in this Agreement changes the at-will nature of employment. Either the Employee or the Company may end the employment relationship at any time, with or without cause or notice, subject to applicable law.</w:t>
       </w:r>
     </w:p>
     <w:p>
@@ -1082,14 +1367,14 @@
           <w:sz w:val="21"/>
           <w:szCs w:val="21"/>
         </w:rPr>
-        <w:t xml:space="preserve">Overtime. </w:t>
-      </w:r>
-      <w:r>
-        <w:rPr>
-          <w:sz w:val="21"/>
-          <w:szCs w:val="21"/>
-        </w:rPr>
-        <w:t xml:space="preserve">As a non-exempt employee, the Employee is paid overtime as required by California law: one-and-one-half times (1.5×) the regular rate for hours over 8 in a workday and over 40 in a workweek, and for the first 8 hours on the seventh consecutive day in a workweek; and double time (2×) for hours over 12 in a workday and over 8 on the seventh consecutive day. Overtime must be authorized in advance but is paid whenever worked.</w:t>
+        <w:t xml:space="preserve">Rate changes. </w:t>
+      </w:r>
+      <w:r>
+        <w:rPr>
+          <w:sz w:val="21"/>
+          <w:szCs w:val="21"/>
+        </w:rPr>
+        <w:t xml:space="preserve">The Company may change pay rates, schedules, or benefits on a going-forward basis. The Employee will receive written notice of any change to the pay rate or payday at least one pay period in advance, and in no event later than required by Labor Code § 2810.5.</w:t>
       </w:r>
     </w:p>
     <w:p>
@@ -1109,299 +1394,14 @@
           <w:sz w:val="21"/>
           <w:szCs w:val="21"/>
         </w:rPr>
-        <w:t xml:space="preserve">Meal &amp; rest breaks. </w:t>
-      </w:r>
-      <w:r>
-        <w:rPr>
-          <w:sz w:val="21"/>
-          <w:szCs w:val="21"/>
-        </w:rPr>
-        <w:t xml:space="preserve">The Company provides meal and rest breaks per California law. The kiosk schedules a paid 10-minute rest break at 2 hours, an unpaid 30-minute meal break at 4 hours, and a second paid 10-minute rest break at 6 hours. Paid rest breaks are counted as time worked; the unpaid meal break is not paid and is deducted from the shift. If a compliant meal or rest break is not provided, the Employee is owed one additional hour of pay at the regular rate for that day, as required by law.</w:t>
-      </w:r>
-    </w:p>
-    <w:p>
-      <w:pPr>
-        <w:pStyle w:val="Heading1"/>
-        <w:spacing w:after="120" w:before="260"/>
-      </w:pPr>
-      <w:r>
-        <w:rPr>
-          <w:b/>
-          <w:bCs/>
-          <w:color w:val="1A2B8C"/>
-          <w:sz w:val="26"/>
-          <w:szCs w:val="26"/>
-        </w:rPr>
-        <w:t xml:space="preserve">4.  Mileage Reimbursement</w:t>
-      </w:r>
-    </w:p>
-    <w:p>
-      <w:pPr>
-        <w:spacing w:after="120" w:line="276"/>
-      </w:pPr>
-      <w:r>
-        <w:rPr>
-          <w:sz w:val="21"/>
-          <w:szCs w:val="21"/>
-        </w:rPr>
-        <w:t xml:space="preserve">Approved business mileage driven in a personal vehicle is reimbursed at the IRS standard mileage rate in effect (</w:t>
-      </w:r>
-      <w:r>
-        <w:rPr>
-          <w:b/>
-          <w:bCs/>
-          <w:sz w:val="21"/>
-          <w:szCs w:val="21"/>
-        </w:rPr>
-        <w:t xml:space="preserve">$0.76 per mile for 2026</w:t>
-      </w:r>
-      <w:r>
-        <w:rPr>
-          <w:sz w:val="21"/>
-          <w:szCs w:val="21"/>
-        </w:rPr>
-        <w:t xml:space="preserve">). Mileage reimbursement is a reimbursement of expenses — it is not wages, is added to net pay, and is not subject to payroll tax withholding. Mileage is recorded through the kiosk and paid on the same biweekly cycle.</w:t>
-      </w:r>
-    </w:p>
-    <w:p>
-      <w:pPr>
-        <w:pStyle w:val="Heading1"/>
-        <w:spacing w:after="120" w:before="260"/>
-      </w:pPr>
-      <w:r>
-        <w:rPr>
-          <w:b/>
-          <w:bCs/>
-          <w:color w:val="1A2B8C"/>
-          <w:sz w:val="26"/>
-          <w:szCs w:val="26"/>
-        </w:rPr>
-        <w:t xml:space="preserve">5.  Taxes &amp; Payroll Deductions</w:t>
-      </w:r>
-    </w:p>
-    <w:p>
-      <w:pPr>
-        <w:spacing w:after="120" w:line="276"/>
-      </w:pPr>
-      <w:r>
-        <w:rPr>
-          <w:sz w:val="21"/>
-          <w:szCs w:val="21"/>
-        </w:rPr>
-        <w:t xml:space="preserve">Gross wages are subject to standard payroll withholding. The following are withheld each pay period:</w:t>
-      </w:r>
-    </w:p>
-    <w:p>
-      <w:pPr>
-        <w:pStyle w:val="ListParagraph"/>
-        <w:numPr>
-          <w:ilvl w:val="0"/>
-          <w:numId w:val="3"/>
-        </w:numPr>
-        <w:spacing w:after="60" w:line="268"/>
-      </w:pPr>
-      <w:r>
-        <w:rPr>
-          <w:b/>
-          <w:bCs/>
-          <w:sz w:val="21"/>
-          <w:szCs w:val="21"/>
-        </w:rPr>
-        <w:t xml:space="preserve">Social Security (FICA / OASDI): </w:t>
-      </w:r>
-      <w:r>
-        <w:rPr>
-          <w:sz w:val="21"/>
-          <w:szCs w:val="21"/>
-        </w:rPr>
-        <w:t xml:space="preserve">6.2% of wages, up to the annual Social Security wage base ($176,100 for 2026).</w:t>
-      </w:r>
-    </w:p>
-    <w:p>
-      <w:pPr>
-        <w:pStyle w:val="ListParagraph"/>
-        <w:numPr>
-          <w:ilvl w:val="0"/>
-          <w:numId w:val="3"/>
-        </w:numPr>
-        <w:spacing w:after="60" w:line="268"/>
-      </w:pPr>
-      <w:r>
-        <w:rPr>
-          <w:b/>
-          <w:bCs/>
-          <w:sz w:val="21"/>
-          <w:szCs w:val="21"/>
-        </w:rPr>
-        <w:t xml:space="preserve">Medicare: </w:t>
-      </w:r>
-      <w:r>
-        <w:rPr>
-          <w:sz w:val="21"/>
-          <w:szCs w:val="21"/>
-        </w:rPr>
-        <w:t xml:space="preserve">1.45% of wages.</w:t>
-      </w:r>
-    </w:p>
-    <w:p>
-      <w:pPr>
-        <w:pStyle w:val="ListParagraph"/>
-        <w:numPr>
-          <w:ilvl w:val="0"/>
-          <w:numId w:val="3"/>
-        </w:numPr>
-        <w:spacing w:after="60" w:line="268"/>
-      </w:pPr>
-      <w:r>
-        <w:rPr>
-          <w:b/>
-          <w:bCs/>
-          <w:sz w:val="21"/>
-          <w:szCs w:val="21"/>
-        </w:rPr>
-        <w:t xml:space="preserve">Federal income tax withholding: </w:t>
-      </w:r>
-      <w:r>
-        <w:rPr>
-          <w:sz w:val="21"/>
-          <w:szCs w:val="21"/>
-        </w:rPr>
-        <w:t xml:space="preserve">based on the Employee’s Form W-4 (filing status and adjustments), per IRS Publication 15-T.</w:t>
-      </w:r>
-    </w:p>
-    <w:p>
-      <w:pPr>
-        <w:pStyle w:val="ListParagraph"/>
-        <w:numPr>
-          <w:ilvl w:val="0"/>
-          <w:numId w:val="3"/>
-        </w:numPr>
-        <w:spacing w:after="60" w:line="268"/>
-      </w:pPr>
-      <w:r>
-        <w:rPr>
-          <w:b/>
-          <w:bCs/>
-          <w:sz w:val="21"/>
-          <w:szCs w:val="21"/>
-        </w:rPr>
-        <w:t xml:space="preserve">California income tax withholding: </w:t>
-      </w:r>
-      <w:r>
-        <w:rPr>
-          <w:sz w:val="21"/>
-          <w:szCs w:val="21"/>
-        </w:rPr>
-        <w:t xml:space="preserve">based on the Employee’s Form DE-4 (filing status and allowances).</w:t>
-      </w:r>
-    </w:p>
-    <w:p>
-      <w:pPr>
-        <w:spacing w:after="120" w:line="276"/>
-      </w:pPr>
-      <w:r>
-        <w:rPr>
-          <w:sz w:val="21"/>
-          <w:szCs w:val="21"/>
-        </w:rPr>
-        <w:t xml:space="preserve">The Employee is responsible for keeping Form W-4 and Form DE-4 current. Net pay = gross wages − total withholding + mileage reimbursement. An itemized pay statement is provided each payday showing hours, rates, gross wages, each deduction, mileage, and net pay, as required by Labor Code § 226.</w:t>
-      </w:r>
-    </w:p>
-    <w:p>
-      <w:pPr>
-        <w:pStyle w:val="Heading1"/>
-        <w:spacing w:after="120" w:before="260"/>
-      </w:pPr>
-      <w:r>
-        <w:rPr>
-          <w:b/>
-          <w:bCs/>
-          <w:color w:val="1A2B8C"/>
-          <w:sz w:val="26"/>
-          <w:szCs w:val="26"/>
-        </w:rPr>
-        <w:t xml:space="preserve">6.  Method of Payment</w:t>
-      </w:r>
-    </w:p>
-    <w:p>
-      <w:pPr>
-        <w:spacing w:after="120" w:line="276"/>
-      </w:pPr>
-      <w:r>
-        <w:rPr>
-          <w:sz w:val="21"/>
-          <w:szCs w:val="21"/>
-        </w:rPr>
-        <w:t xml:space="preserve">Wages are paid by (check one): </w:t>
-      </w:r>
-    </w:p>
-    <w:p>
-      <w:pPr>
-        <w:pStyle w:val="ListParagraph"/>
-        <w:numPr>
-          <w:ilvl w:val="0"/>
-          <w:numId w:val="3"/>
-        </w:numPr>
-        <w:spacing w:after="60" w:line="268"/>
-      </w:pPr>
-      <w:r>
-        <w:rPr>
-          <w:sz w:val="21"/>
-          <w:szCs w:val="21"/>
-        </w:rPr>
-        <w:t xml:space="preserve">☐  Direct deposit to the account on file (voided check / authorization form required), or</w:t>
-      </w:r>
-    </w:p>
-    <w:p>
-      <w:pPr>
-        <w:pStyle w:val="ListParagraph"/>
-        <w:numPr>
-          <w:ilvl w:val="0"/>
-          <w:numId w:val="3"/>
-        </w:numPr>
-        <w:spacing w:after="60" w:line="268"/>
-      </w:pPr>
-      <w:r>
-        <w:rPr>
-          <w:sz w:val="21"/>
-          <w:szCs w:val="21"/>
-        </w:rPr>
-        <w:t xml:space="preserve">☐  Live check.</w:t>
-      </w:r>
-    </w:p>
-    <w:p>
-      <w:pPr>
-        <w:spacing w:after="120" w:line="276"/>
-      </w:pPr>
-      <w:r>
-        <w:rPr>
-          <w:sz w:val="21"/>
-          <w:szCs w:val="21"/>
-        </w:rPr>
-        <w:t xml:space="preserve">Selected method: </w:t>
-      </w:r>
-      <w:r>
-        <w:rPr>
-          <w:sz w:val="21"/>
-          <w:szCs w:val="21"/>
-        </w:rPr>
-        <w:t xml:space="preserve">________________________________________ </w:t>
-      </w:r>
-    </w:p>
-    <w:p>
-      <w:pPr>
-        <w:pStyle w:val="Heading1"/>
-        <w:spacing w:after="120" w:before="260"/>
-      </w:pPr>
-      <w:r>
-        <w:rPr>
-          <w:b/>
-          <w:bCs/>
-          <w:color w:val="1A2B8C"/>
-          <w:sz w:val="26"/>
-          <w:szCs w:val="26"/>
-        </w:rPr>
-        <w:t xml:space="preserve">7.  General Terms</w:t>
+        <w:t xml:space="preserve">Final pay. </w:t>
+      </w:r>
+      <w:r>
+        <w:rPr>
+          <w:sz w:val="21"/>
+          <w:szCs w:val="21"/>
+        </w:rPr>
+        <w:t xml:space="preserve">On separation, final wages are paid within the timeframe required by California law (immediately on an involuntary termination; within 72 hours of a resignation without notice, or on the last day if 72+ hours’ notice is given).</w:t>
       </w:r>
     </w:p>
     <w:p>
@@ -1421,87 +1421,6 @@
           <w:sz w:val="21"/>
           <w:szCs w:val="21"/>
         </w:rPr>
-        <w:t xml:space="preserve">At-will employment. </w:t>
-      </w:r>
-      <w:r>
-        <w:rPr>
-          <w:sz w:val="21"/>
-          <w:szCs w:val="21"/>
-        </w:rPr>
-        <w:t xml:space="preserve">Nothing in this Agreement changes the at-will nature of employment. Either the Employee or the Company may end the employment relationship at any time, with or without cause or notice, subject to applicable law.</w:t>
-      </w:r>
-    </w:p>
-    <w:p>
-      <w:pPr>
-        <w:pStyle w:val="ListParagraph"/>
-        <w:numPr>
-          <w:ilvl w:val="0"/>
-          <w:numId w:val="2"/>
-        </w:numPr>
-        <w:spacing w:after="100" w:before="140" w:line="276"/>
-      </w:pPr>
-      <w:r>
-        <w:rPr>
-          <w:b/>
-          <w:bCs/>
-          <w:color w:val="111827"/>
-          <w:sz w:val="21"/>
-          <w:szCs w:val="21"/>
-        </w:rPr>
-        <w:t xml:space="preserve">Rate changes. </w:t>
-      </w:r>
-      <w:r>
-        <w:rPr>
-          <w:sz w:val="21"/>
-          <w:szCs w:val="21"/>
-        </w:rPr>
-        <w:t xml:space="preserve">The Company may change pay rates, schedules, or benefits on a going-forward basis. The Employee will receive written notice of any change to the pay rate or payday at least one pay period in advance, and in no event later than required by Labor Code § 2810.5.</w:t>
-      </w:r>
-    </w:p>
-    <w:p>
-      <w:pPr>
-        <w:pStyle w:val="ListParagraph"/>
-        <w:numPr>
-          <w:ilvl w:val="0"/>
-          <w:numId w:val="2"/>
-        </w:numPr>
-        <w:spacing w:after="100" w:before="140" w:line="276"/>
-      </w:pPr>
-      <w:r>
-        <w:rPr>
-          <w:b/>
-          <w:bCs/>
-          <w:color w:val="111827"/>
-          <w:sz w:val="21"/>
-          <w:szCs w:val="21"/>
-        </w:rPr>
-        <w:t xml:space="preserve">Final pay. </w:t>
-      </w:r>
-      <w:r>
-        <w:rPr>
-          <w:sz w:val="21"/>
-          <w:szCs w:val="21"/>
-        </w:rPr>
-        <w:t xml:space="preserve">On separation, final wages are paid within the timeframe required by California law (immediately on an involuntary termination; within 72 hours of a resignation without notice, or on the last day if 72+ hours’ notice is given).</w:t>
-      </w:r>
-    </w:p>
-    <w:p>
-      <w:pPr>
-        <w:pStyle w:val="ListParagraph"/>
-        <w:numPr>
-          <w:ilvl w:val="0"/>
-          <w:numId w:val="2"/>
-        </w:numPr>
-        <w:spacing w:after="100" w:before="140" w:line="276"/>
-      </w:pPr>
-      <w:r>
-        <w:rPr>
-          <w:b/>
-          <w:bCs/>
-          <w:color w:val="111827"/>
-          <w:sz w:val="21"/>
-          <w:szCs w:val="21"/>
-        </w:rPr>
         <w:t xml:space="preserve">Entire agreement. </w:t>
       </w:r>
       <w:r>
@@ -1537,7 +1456,7 @@
           <w:sz w:val="21"/>
           <w:szCs w:val="21"/>
         </w:rPr>
-        <w:t xml:space="preserve">By signing below, the Employee acknowledges having read and understood this Agreement, including the biweekly (every-other-Friday) pay schedule and two-week pay-period lag, the Draw and Travel rates, overtime and break rules, mileage reimbursement, and payroll deductions.</w:t>
+        <w:t xml:space="preserve">By signing below, the Employee acknowledges having read and understood this Agreement, including the biweekly (every-other-Friday) pay schedule and two-week pay-period lag, the Draw and Travel rates, the meal- and rest-break acknowledgement, mileage reimbursement, and payroll deductions.</w:t>
       </w:r>
     </w:p>
     <w:tbl>

</xml_diff>

<commit_message>
pay: raise rate floor to $17; add rest break every 4 hours
Raise the travel-rate floor from $16.50 (CA minimum) to a $17 company
floor in the kiosk pay profile, payroll engine, and save/enforcement
paths. Contract §2 restated as a $17 rate floor above minimum wage, and
§3 now acknowledges a paid 10-min rest break for every four hours worked.

Co-Authored-By: Claude Opus 4.8 <noreply@anthropic.com>
</commit_message>
<xml_diff>
--- a/clients/juno-tech/Phlebotomist-Compensation-Agreement.docx
+++ b/clients/juno-tech/Phlebotomist-Compensation-Agreement.docx
@@ -973,14 +973,14 @@
           <w:sz w:val="21"/>
           <w:szCs w:val="21"/>
         </w:rPr>
-        <w:t xml:space="preserve">Minimum wage floor. </w:t>
-      </w:r>
-      <w:r>
-        <w:rPr>
-          <w:sz w:val="21"/>
-          <w:szCs w:val="21"/>
-        </w:rPr>
-        <w:t xml:space="preserve">The Travel Rate, and every rate paid under this Agreement, will never be less than $16.50 per hour (the applicable California minimum wage). If the legal minimum wage increases, rates below the new minimum are raised automatically to comply.</w:t>
+        <w:t xml:space="preserve">Rate floor. </w:t>
+      </w:r>
+      <w:r>
+        <w:rPr>
+          <w:sz w:val="21"/>
+          <w:szCs w:val="21"/>
+        </w:rPr>
+        <w:t xml:space="preserve">The Travel Rate, and every rate paid under this Agreement, will never be less than $17.00 per hour — a company floor set above the California minimum wage. If the legal minimum wage ever rises above this floor, rates are raised further to comply.</w:t>
       </w:r>
     </w:p>
     <w:p>
@@ -1035,7 +1035,7 @@
           <w:sz w:val="21"/>
           <w:szCs w:val="21"/>
         </w:rPr>
-        <w:t xml:space="preserve">The Employee acknowledges the right to a paid 10-minute rest break and an unpaid 30-minute meal break, to be provided no later than the end of the fifth hour of work. The Company’s full meal- and rest-break policy is set out in a separate document.</w:t>
+        <w:t xml:space="preserve">The Employee acknowledges the right to a paid 10-minute rest break for every four hours worked, and an unpaid 30-minute meal break to be provided no later than the end of the fifth hour of work. The Company’s full meal- and rest-break policy is set out in a separate document.</w:t>
       </w:r>
     </w:p>
     <w:p>

</xml_diff>